<commit_message>
Odkazy uvnitr materialu srovnany s nazvy na webu
Balicky odkazovaly samy na sebe puvodnimi nazvy (01_PRO_UCITELE/
AI_plany_hodin_a_metodika.docx), jenze na webu se soubory jmenuji
cesky. Ucitel by podle metodiky hledal soubor, ktery neexistuje.

- prepsano 26 souboru: nazvy slozek, nazvy souboru i vety typu
  "ve slozce 03" -> "ve slozce Podklady k aktivitam"
- u .docx/.pptx se menil jen text v XML castech, zbytek zipu zustal
  bit po bitu stejny; overena celistvost vsech 26 archivu
- "Prijmeni_Jmeno_Internet_bezpecnost.docx" ponechano - to neni odkaz
  na soubor, ale pokyn, jak si ma zak pojmenovat vlastni kopii

Odznak publika oznacuje vyjimku, ne vychozi stav:
- "zaci" viselo na vsem mimo ucitelskou slozku, tedy i na pruvodci
  pro ucitele. Vychozi publikum je ted "both" a odznak se ukazuje
  jen u slozek "Pro ucitele" / "Pro zaky".
- z licencniho souboru odstranena veta "Tyto soubory dodal uzivatel
  jako overeny zdroj"

Co-Authored-By: Claude Opus 4.8 <noreply@anthropic.com>
</commit_message>
<xml_diff>
--- a/public/materialy/1L/10/Pro učitele/Offline záloha hodin 4-6.docx
+++ b/public/materialy/1L/10/Pro učitele/Offline záloha hodin 4-6.docx
@@ -296,7 +296,7 @@
           <w:color w:val="5C6965"/>
           <w:sz w:val="19"/>
         </w:rPr>
-        <w:t>04_promptova_dilna.txt, varianta A (Vysvětlení pojmu). Tři iterace téhož úkolu.</w:t>
+        <w:t>4. Promptová dílna.txt, varianta A (Vysvětlení pojmu). Tři iterace téhož úkolu.</w:t>
       </w:r>
     </w:p>
     <w:tbl>
@@ -659,7 +659,7 @@
           <w:color w:val="5C6965"/>
           <w:sz w:val="19"/>
         </w:rPr>
-        <w:t>05_zdrojovy_balicek_rekuperace.txt. Cílem je informační karta pouze z dodaného zdroje.</w:t>
+        <w:t>5. Zdrojový balíček - rekuperace.txt. Cílem je informační karta pouze z dodaného zdroje.</w:t>
       </w:r>
     </w:p>
     <w:tbl>
@@ -992,7 +992,7 @@
           <w:color w:val="5C6965"/>
           <w:sz w:val="19"/>
         </w:rPr>
-        <w:t>studenti porovnají vytištěné výstupy se soubory 05_vystup_k_oprave.txt a 05_vystupy_k_posouzeni.txt, označí PODLOŽENO / PŘEHNÁNO / VE ZDROJI NENÍ a vyplní anotovaný log. Tato hodina funguje offline téměř beze ztráty.</w:t>
+        <w:t>studenti porovnají vytištěné výstupy se soubory 5. Výstup k opravě.txt a 5. Výstupy k posouzení.txt, označí PODLOŽENO / PŘEHNÁNO / VE ZDROJI NENÍ a vyplní anotovaný log. Tato hodina funguje offline téměř beze ztráty.</w:t>
       </w:r>
     </w:p>
     <w:p>
@@ -1022,7 +1022,7 @@
           <w:color w:val="5C6965"/>
           <w:sz w:val="19"/>
         </w:rPr>
-        <w:t>06_zaverecna_vyzva.txt, varianta B (Studijní sada z fiktivního zdroje).</w:t>
+        <w:t>6. Závěrečná výzva.txt, varianta B (Studijní sada z fiktivního zdroje).</w:t>
       </w:r>
     </w:p>
     <w:tbl>

</xml_diff>